<commit_message>
docs: agrega sección de pruebas automatizadas al informe técnico
El Informe Técnico ahora documenta el arnés tests/test_offline_sync.js
en "Resultados y Pruebas": metodología (sandbox de Node con vm sobre
el script.js real), los 6 escenarios cubiertos y una tabla con las 16
verificaciones aprobadas. Reemplaza el párrafo anterior, que describía
una simulación manual en DevTools que en realidad nunca se ejecutó,
por la descripción precisa de la prueba automatizada real. También se
agrega tests/ a la estructura de carpetas del proyecto.

Los documentos 02 y 03 se re-empaquetaron sin cambios de contenido al
correr el generador junto con el 01.
</commit_message>
<xml_diff>
--- a/documentacion/01_Informe_Tecnico_ASIS_CAM_APA7.docx
+++ b/documentacion/01_Informe_Tecnico_ASIS_CAM_APA7.docx
@@ -877,7 +877,35 @@
                 <w:sz w:val="19"/>
                 <w:szCs w:val="19"/>
               </w:rPr>
-              <w:t xml:space="preserve">└── package.json        # Metadatos del proyecto y scripts de despliegue</w:t>
+              <w:t xml:space="preserve">├── tests/</w:t>
+            </w:r>
+          </w:p>
+          <w:p>
+            <w:pPr>
+              <w:spacing w:after="0" w:line="260" w:lineRule="auto"/>
+            </w:pPr>
+            <w:r>
+              <w:rPr>
+                <w:rFonts w:ascii="Consolas" w:cs="Consolas" w:eastAsia="Consolas" w:hAnsi="Consolas"/>
+                <w:color w:val="D4D4D4"/>
+                <w:sz w:val="19"/>
+                <w:szCs w:val="19"/>
+              </w:rPr>
+              <w:t xml:space="preserve">│   └── test_offline_sync.js # Arnés de pruebas de sincronización diferida</w:t>
+            </w:r>
+          </w:p>
+          <w:p>
+            <w:pPr>
+              <w:spacing w:after="0" w:line="260" w:lineRule="auto"/>
+            </w:pPr>
+            <w:r>
+              <w:rPr>
+                <w:rFonts w:ascii="Consolas" w:cs="Consolas" w:eastAsia="Consolas" w:hAnsi="Consolas"/>
+                <w:color w:val="D4D4D4"/>
+                <w:sz w:val="19"/>
+                <w:szCs w:val="19"/>
+              </w:rPr>
+              <w:t xml:space="preserve">└── package.json        # Metadatos del proyecto, scripts de despliegue y "npm test"</w:t>
             </w:r>
           </w:p>
         </w:tc>
@@ -2396,7 +2424,7 @@
           <w:sz w:val="26"/>
           <w:szCs w:val="26"/>
         </w:rPr>
-        <w:t xml:space="preserve">Prueba de la sincronización diferida automática (offline-first)</w:t>
+        <w:t xml:space="preserve">Pruebas automatizadas de la sincronización diferida (tests/test_offline_sync.js)</w:t>
       </w:r>
     </w:p>
     <w:p>
@@ -2415,7 +2443,1521 @@
           <w:sz w:val="24"/>
           <w:szCs w:val="24"/>
         </w:rPr>
-        <w:t xml:space="preserve">Se simuló la pérdida de conectividad desactivando la red del dispositivo (modo offline de las herramientas de desarrollo del navegador) y se registró una asistencia y una alerta mientras la aplicación permanecía sin conexión. Se confirmó que ambos cambios quedaron disponibles de inmediato en la interfaz y guardados en localStorage, y que la clave correspondiente quedó registrada en la cola de pendientes (sb_pending_sync). Al restablecer la conectividad, se verificó que el evento online disparó automáticamente la sincronización, que los cambios se reflejaron en la tabla app_data de Supabase sin intervención manual, que la cola de pendientes quedó vacía y que se mostró el aviso de confirmación correspondiente. Se verificó además que, si la aplicación se recarga estando aún sin conexión, la cola de pendientes persiste en localStorage y se procesa igual al reabrir la aplicación ya con señal.</w:t>
+        <w:t xml:space="preserve">Para verificar el mecanismo de sincronización diferida descrito en el punto 10 del Desarrollo sin depender de un navegador real ni del hardware de cámara necesario para el reconocimiento facial, se construyó un arnés de pruebas automatizado (tests/test_offline_sync.js) que ejecuta el archivo script.js real del proyecto —sin modificarlo ni reescribirlo— dentro de un contexto aislado de Node.js (módulo vm). Ese contexto provee implementaciones simuladas de localStorage, de window/document y de un cliente de Supabase falso cuyo comportamiento se puede alternar entre "conectado" y "desconectado" a voluntad, registrando además cada intento de escritura para poder inspeccionarlo. De esta forma, el arnés ejercita el código de producción tal cual corre en el navegador, reemplazando únicamente el entorno externo (red, almacenamiento, DOM) por versiones controlables desde la prueba.</w:t>
+      </w:r>
+    </w:p>
+    <w:p>
+      <w:pPr>
+        <w:spacing w:after="0" w:line="480" w:lineRule="auto"/>
+        <w:ind w:firstLine="720"/>
+        <w:jc w:val="both"/>
+      </w:pPr>
+      <w:r>
+        <w:rPr>
+          <w:rFonts w:ascii="Times New Roman" w:cs="Times New Roman" w:eastAsia="Times New Roman" w:hAnsi="Times New Roman"/>
+          <w:b w:val="false"/>
+          <w:bCs w:val="false"/>
+          <w:i w:val="false"/>
+          <w:iCs w:val="false"/>
+          <w:sz w:val="24"/>
+          <w:szCs w:val="24"/>
+        </w:rPr>
+        <w:t xml:space="preserve">El arnés recorre seis escenarios encadenados: (1) una carga inicial de la aplicación con conexión disponible; (2) la pérdida de conectividad seguida del registro de una asistencia, verificando el guardado local inmediato y el encolado de la clave en sb_pending_sync; (3) un segundo guardado sin conexión (una alerta) para confirmar que el mecanismo admite varias colecciones pendientes a la vez; (4) el restablecimiento de la conexión, disparando el evento online y verificando que ambas colecciones se suban solas con su valor más reciente y que la cola quede vacía; (5) un nuevo guardado offline seguido de la simulación de una recarga de página (un contexto nuevo que reutiliza el mismo localStorage), para confirmar que la cola de pendientes sobrevive; y (6) la reapertura de la aplicación ya con señal, confirmando que el intento de sincronización del arranque sube en solitario lo que había quedado pendiente de la sesión anterior. Cada escenario se corrobora con aserciones puntuales sobre el estado de localStorage, la cola de pendientes, los avisos mostrados al usuario y el contenido exacto enviado a Supabase.</w:t>
+      </w:r>
+    </w:p>
+    <w:p>
+      <w:pPr>
+        <w:spacing w:after="0" w:line="480" w:lineRule="auto"/>
+        <w:jc w:val="both"/>
+      </w:pPr>
+      <w:r>
+        <w:rPr>
+          <w:rFonts w:ascii="Times New Roman" w:cs="Times New Roman" w:eastAsia="Times New Roman" w:hAnsi="Times New Roman"/>
+          <w:b w:val="false"/>
+          <w:bCs w:val="false"/>
+          <w:i w:val="false"/>
+          <w:iCs w:val="false"/>
+          <w:sz w:val="24"/>
+          <w:szCs w:val="24"/>
+        </w:rPr>
+        <w:t xml:space="preserve">El resultado de la última ejecución (reproducible con npm test) fue de 16 verificaciones sobre 16 aprobadas:</w:t>
+      </w:r>
+    </w:p>
+    <w:tbl>
+      <w:tblPr>
+        <w:tblW w:type="pct" w:w="100%"/>
+        <w:tblBorders>
+          <w:top w:val="single" w:color="BFBFBF" w:sz="4"/>
+          <w:left w:val="single" w:color="BFBFBF" w:sz="4"/>
+          <w:bottom w:val="single" w:color="BFBFBF" w:sz="4"/>
+          <w:right w:val="single" w:color="BFBFBF" w:sz="4"/>
+          <w:insideH w:val="single" w:color="BFBFBF" w:sz="4"/>
+          <w:insideV w:val="single" w:color="BFBFBF" w:sz="4"/>
+        </w:tblBorders>
+      </w:tblPr>
+      <w:tblGrid>
+        <w:gridCol w:w="100"/>
+        <w:gridCol w:w="100"/>
+        <w:gridCol w:w="100"/>
+      </w:tblGrid>
+      <w:tr>
+        <w:trPr>
+          <w:tblHeader/>
+        </w:trPr>
+        <w:tc>
+          <w:tcPr>
+            <w:shd w:fill="1B3A5C" w:val="clear"/>
+            <w:tcMar>
+              <w:top w:type="dxa" w:w="80"/>
+              <w:left w:type="dxa" w:w="120"/>
+              <w:bottom w:type="dxa" w:w="80"/>
+              <w:right w:type="dxa" w:w="120"/>
+            </w:tcMar>
+            <w:vAlign w:val="center"/>
+          </w:tcPr>
+          <w:p>
+            <w:pPr>
+              <w:jc w:val="center"/>
+            </w:pPr>
+            <w:r>
+              <w:rPr>
+                <w:rFonts w:ascii="Times New Roman" w:cs="Times New Roman" w:eastAsia="Times New Roman" w:hAnsi="Times New Roman"/>
+                <w:b/>
+                <w:bCs/>
+                <w:color w:val="FFFFFF"/>
+                <w:sz w:val="20"/>
+                <w:szCs w:val="20"/>
+              </w:rPr>
+              <w:t xml:space="preserve">Paso</w:t>
+            </w:r>
+          </w:p>
+        </w:tc>
+        <w:tc>
+          <w:tcPr>
+            <w:shd w:fill="1B3A5C" w:val="clear"/>
+            <w:tcMar>
+              <w:top w:type="dxa" w:w="80"/>
+              <w:left w:type="dxa" w:w="120"/>
+              <w:bottom w:type="dxa" w:w="80"/>
+              <w:right w:type="dxa" w:w="120"/>
+            </w:tcMar>
+            <w:vAlign w:val="center"/>
+          </w:tcPr>
+          <w:p>
+            <w:pPr>
+              <w:jc w:val="center"/>
+            </w:pPr>
+            <w:r>
+              <w:rPr>
+                <w:rFonts w:ascii="Times New Roman" w:cs="Times New Roman" w:eastAsia="Times New Roman" w:hAnsi="Times New Roman"/>
+                <w:b/>
+                <w:bCs/>
+                <w:color w:val="FFFFFF"/>
+                <w:sz w:val="20"/>
+                <w:szCs w:val="20"/>
+              </w:rPr>
+              <w:t xml:space="preserve">Verificación</w:t>
+            </w:r>
+          </w:p>
+        </w:tc>
+        <w:tc>
+          <w:tcPr>
+            <w:shd w:fill="1B3A5C" w:val="clear"/>
+            <w:tcMar>
+              <w:top w:type="dxa" w:w="80"/>
+              <w:left w:type="dxa" w:w="120"/>
+              <w:bottom w:type="dxa" w:w="80"/>
+              <w:right w:type="dxa" w:w="120"/>
+            </w:tcMar>
+            <w:vAlign w:val="center"/>
+          </w:tcPr>
+          <w:p>
+            <w:pPr>
+              <w:jc w:val="center"/>
+            </w:pPr>
+            <w:r>
+              <w:rPr>
+                <w:rFonts w:ascii="Times New Roman" w:cs="Times New Roman" w:eastAsia="Times New Roman" w:hAnsi="Times New Roman"/>
+                <w:b/>
+                <w:bCs/>
+                <w:color w:val="FFFFFF"/>
+                <w:sz w:val="20"/>
+                <w:szCs w:val="20"/>
+              </w:rPr>
+              <w:t xml:space="preserve">Resultado</w:t>
+            </w:r>
+          </w:p>
+        </w:tc>
+      </w:tr>
+      <w:tr>
+        <w:tc>
+          <w:tcPr>
+            <w:tcMar>
+              <w:top w:type="dxa" w:w="80"/>
+              <w:left w:type="dxa" w:w="120"/>
+              <w:bottom w:type="dxa" w:w="80"/>
+              <w:right w:type="dxa" w:w="120"/>
+            </w:tcMar>
+            <w:vAlign w:val="center"/>
+          </w:tcPr>
+          <w:p>
+            <w:pPr>
+              <w:jc w:val="left"/>
+            </w:pPr>
+            <w:r>
+              <w:rPr>
+                <w:rFonts w:ascii="Times New Roman" w:cs="Times New Roman" w:eastAsia="Times New Roman" w:hAnsi="Times New Roman"/>
+                <w:b w:val="false"/>
+                <w:bCs w:val="false"/>
+                <w:color w:val="000000"/>
+                <w:sz w:val="20"/>
+                <w:szCs w:val="20"/>
+              </w:rPr>
+              <w:t xml:space="preserve">1</w:t>
+            </w:r>
+          </w:p>
+        </w:tc>
+        <w:tc>
+          <w:tcPr>
+            <w:tcMar>
+              <w:top w:type="dxa" w:w="80"/>
+              <w:left w:type="dxa" w:w="120"/>
+              <w:bottom w:type="dxa" w:w="80"/>
+              <w:right w:type="dxa" w:w="120"/>
+            </w:tcMar>
+            <w:vAlign w:val="center"/>
+          </w:tcPr>
+          <w:p>
+            <w:pPr>
+              <w:jc w:val="left"/>
+            </w:pPr>
+            <w:r>
+              <w:rPr>
+                <w:rFonts w:ascii="Times New Roman" w:cs="Times New Roman" w:eastAsia="Times New Roman" w:hAnsi="Times New Roman"/>
+                <w:b w:val="false"/>
+                <w:bCs w:val="false"/>
+                <w:color w:val="000000"/>
+                <w:sz w:val="20"/>
+                <w:szCs w:val="20"/>
+              </w:rPr>
+              <w:t xml:space="preserve">Carga inicial online: no quedan claves pendientes al arrancar</w:t>
+            </w:r>
+          </w:p>
+        </w:tc>
+        <w:tc>
+          <w:tcPr>
+            <w:tcMar>
+              <w:top w:type="dxa" w:w="80"/>
+              <w:left w:type="dxa" w:w="120"/>
+              <w:bottom w:type="dxa" w:w="80"/>
+              <w:right w:type="dxa" w:w="120"/>
+            </w:tcMar>
+            <w:vAlign w:val="center"/>
+          </w:tcPr>
+          <w:p>
+            <w:pPr>
+              <w:jc w:val="left"/>
+            </w:pPr>
+            <w:r>
+              <w:rPr>
+                <w:rFonts w:ascii="Times New Roman" w:cs="Times New Roman" w:eastAsia="Times New Roman" w:hAnsi="Times New Roman"/>
+                <w:b w:val="false"/>
+                <w:bCs w:val="false"/>
+                <w:color w:val="000000"/>
+                <w:sz w:val="20"/>
+                <w:szCs w:val="20"/>
+              </w:rPr>
+              <w:t xml:space="preserve">Aprobada</w:t>
+            </w:r>
+          </w:p>
+        </w:tc>
+      </w:tr>
+      <w:tr>
+        <w:tc>
+          <w:tcPr>
+            <w:shd w:fill="F2F2F2" w:val="clear"/>
+            <w:tcMar>
+              <w:top w:type="dxa" w:w="80"/>
+              <w:left w:type="dxa" w:w="120"/>
+              <w:bottom w:type="dxa" w:w="80"/>
+              <w:right w:type="dxa" w:w="120"/>
+            </w:tcMar>
+            <w:vAlign w:val="center"/>
+          </w:tcPr>
+          <w:p>
+            <w:pPr>
+              <w:jc w:val="left"/>
+            </w:pPr>
+            <w:r>
+              <w:rPr>
+                <w:rFonts w:ascii="Times New Roman" w:cs="Times New Roman" w:eastAsia="Times New Roman" w:hAnsi="Times New Roman"/>
+                <w:b w:val="false"/>
+                <w:bCs w:val="false"/>
+                <w:color w:val="000000"/>
+                <w:sz w:val="20"/>
+                <w:szCs w:val="20"/>
+              </w:rPr>
+              <w:t xml:space="preserve">1</w:t>
+            </w:r>
+          </w:p>
+        </w:tc>
+        <w:tc>
+          <w:tcPr>
+            <w:shd w:fill="F2F2F2" w:val="clear"/>
+            <w:tcMar>
+              <w:top w:type="dxa" w:w="80"/>
+              <w:left w:type="dxa" w:w="120"/>
+              <w:bottom w:type="dxa" w:w="80"/>
+              <w:right w:type="dxa" w:w="120"/>
+            </w:tcMar>
+            <w:vAlign w:val="center"/>
+          </w:tcPr>
+          <w:p>
+            <w:pPr>
+              <w:jc w:val="left"/>
+            </w:pPr>
+            <w:r>
+              <w:rPr>
+                <w:rFonts w:ascii="Times New Roman" w:cs="Times New Roman" w:eastAsia="Times New Roman" w:hAnsi="Times New Roman"/>
+                <w:b w:val="false"/>
+                <w:bCs w:val="false"/>
+                <w:color w:val="000000"/>
+                <w:sz w:val="20"/>
+                <w:szCs w:val="20"/>
+              </w:rPr>
+              <w:t xml:space="preserve">Los datos se cargan correctamente desde el backend simulado</w:t>
+            </w:r>
+          </w:p>
+        </w:tc>
+        <w:tc>
+          <w:tcPr>
+            <w:shd w:fill="F2F2F2" w:val="clear"/>
+            <w:tcMar>
+              <w:top w:type="dxa" w:w="80"/>
+              <w:left w:type="dxa" w:w="120"/>
+              <w:bottom w:type="dxa" w:w="80"/>
+              <w:right w:type="dxa" w:w="120"/>
+            </w:tcMar>
+            <w:vAlign w:val="center"/>
+          </w:tcPr>
+          <w:p>
+            <w:pPr>
+              <w:jc w:val="left"/>
+            </w:pPr>
+            <w:r>
+              <w:rPr>
+                <w:rFonts w:ascii="Times New Roman" w:cs="Times New Roman" w:eastAsia="Times New Roman" w:hAnsi="Times New Roman"/>
+                <w:b w:val="false"/>
+                <w:bCs w:val="false"/>
+                <w:color w:val="000000"/>
+                <w:sz w:val="20"/>
+                <w:szCs w:val="20"/>
+              </w:rPr>
+              <w:t xml:space="preserve">Aprobada</w:t>
+            </w:r>
+          </w:p>
+        </w:tc>
+      </w:tr>
+      <w:tr>
+        <w:tc>
+          <w:tcPr>
+            <w:tcMar>
+              <w:top w:type="dxa" w:w="80"/>
+              <w:left w:type="dxa" w:w="120"/>
+              <w:bottom w:type="dxa" w:w="80"/>
+              <w:right w:type="dxa" w:w="120"/>
+            </w:tcMar>
+            <w:vAlign w:val="center"/>
+          </w:tcPr>
+          <w:p>
+            <w:pPr>
+              <w:jc w:val="left"/>
+            </w:pPr>
+            <w:r>
+              <w:rPr>
+                <w:rFonts w:ascii="Times New Roman" w:cs="Times New Roman" w:eastAsia="Times New Roman" w:hAnsi="Times New Roman"/>
+                <w:b w:val="false"/>
+                <w:bCs w:val="false"/>
+                <w:color w:val="000000"/>
+                <w:sz w:val="20"/>
+                <w:szCs w:val="20"/>
+              </w:rPr>
+              <w:t xml:space="preserve">2</w:t>
+            </w:r>
+          </w:p>
+        </w:tc>
+        <w:tc>
+          <w:tcPr>
+            <w:tcMar>
+              <w:top w:type="dxa" w:w="80"/>
+              <w:left w:type="dxa" w:w="120"/>
+              <w:bottom w:type="dxa" w:w="80"/>
+              <w:right w:type="dxa" w:w="120"/>
+            </w:tcMar>
+            <w:vAlign w:val="center"/>
+          </w:tcPr>
+          <w:p>
+            <w:pPr>
+              <w:jc w:val="left"/>
+            </w:pPr>
+            <w:r>
+              <w:rPr>
+                <w:rFonts w:ascii="Times New Roman" w:cs="Times New Roman" w:eastAsia="Times New Roman" w:hAnsi="Times New Roman"/>
+                <w:b w:val="false"/>
+                <w:bCs w:val="false"/>
+                <w:color w:val="000000"/>
+                <w:sz w:val="20"/>
+                <w:szCs w:val="20"/>
+              </w:rPr>
+              <w:t xml:space="preserve">Se muestra el aviso de "sin conexión" al perder la red</w:t>
+            </w:r>
+          </w:p>
+        </w:tc>
+        <w:tc>
+          <w:tcPr>
+            <w:tcMar>
+              <w:top w:type="dxa" w:w="80"/>
+              <w:left w:type="dxa" w:w="120"/>
+              <w:bottom w:type="dxa" w:w="80"/>
+              <w:right w:type="dxa" w:w="120"/>
+            </w:tcMar>
+            <w:vAlign w:val="center"/>
+          </w:tcPr>
+          <w:p>
+            <w:pPr>
+              <w:jc w:val="left"/>
+            </w:pPr>
+            <w:r>
+              <w:rPr>
+                <w:rFonts w:ascii="Times New Roman" w:cs="Times New Roman" w:eastAsia="Times New Roman" w:hAnsi="Times New Roman"/>
+                <w:b w:val="false"/>
+                <w:bCs w:val="false"/>
+                <w:color w:val="000000"/>
+                <w:sz w:val="20"/>
+                <w:szCs w:val="20"/>
+              </w:rPr>
+              <w:t xml:space="preserve">Aprobada</w:t>
+            </w:r>
+          </w:p>
+        </w:tc>
+      </w:tr>
+      <w:tr>
+        <w:tc>
+          <w:tcPr>
+            <w:shd w:fill="F2F2F2" w:val="clear"/>
+            <w:tcMar>
+              <w:top w:type="dxa" w:w="80"/>
+              <w:left w:type="dxa" w:w="120"/>
+              <w:bottom w:type="dxa" w:w="80"/>
+              <w:right w:type="dxa" w:w="120"/>
+            </w:tcMar>
+            <w:vAlign w:val="center"/>
+          </w:tcPr>
+          <w:p>
+            <w:pPr>
+              <w:jc w:val="left"/>
+            </w:pPr>
+            <w:r>
+              <w:rPr>
+                <w:rFonts w:ascii="Times New Roman" w:cs="Times New Roman" w:eastAsia="Times New Roman" w:hAnsi="Times New Roman"/>
+                <w:b w:val="false"/>
+                <w:bCs w:val="false"/>
+                <w:color w:val="000000"/>
+                <w:sz w:val="20"/>
+                <w:szCs w:val="20"/>
+              </w:rPr>
+              <w:t xml:space="preserve">2</w:t>
+            </w:r>
+          </w:p>
+        </w:tc>
+        <w:tc>
+          <w:tcPr>
+            <w:shd w:fill="F2F2F2" w:val="clear"/>
+            <w:tcMar>
+              <w:top w:type="dxa" w:w="80"/>
+              <w:left w:type="dxa" w:w="120"/>
+              <w:bottom w:type="dxa" w:w="80"/>
+              <w:right w:type="dxa" w:w="120"/>
+            </w:tcMar>
+            <w:vAlign w:val="center"/>
+          </w:tcPr>
+          <w:p>
+            <w:pPr>
+              <w:jc w:val="left"/>
+            </w:pPr>
+            <w:r>
+              <w:rPr>
+                <w:rFonts w:ascii="Times New Roman" w:cs="Times New Roman" w:eastAsia="Times New Roman" w:hAnsi="Times New Roman"/>
+                <w:b w:val="false"/>
+                <w:bCs w:val="false"/>
+                <w:color w:val="000000"/>
+                <w:sz w:val="20"/>
+                <w:szCs w:val="20"/>
+              </w:rPr>
+              <w:t xml:space="preserve">El fichaje queda guardado en localStorage (sb_cache_attendance)</w:t>
+            </w:r>
+          </w:p>
+        </w:tc>
+        <w:tc>
+          <w:tcPr>
+            <w:shd w:fill="F2F2F2" w:val="clear"/>
+            <w:tcMar>
+              <w:top w:type="dxa" w:w="80"/>
+              <w:left w:type="dxa" w:w="120"/>
+              <w:bottom w:type="dxa" w:w="80"/>
+              <w:right w:type="dxa" w:w="120"/>
+            </w:tcMar>
+            <w:vAlign w:val="center"/>
+          </w:tcPr>
+          <w:p>
+            <w:pPr>
+              <w:jc w:val="left"/>
+            </w:pPr>
+            <w:r>
+              <w:rPr>
+                <w:rFonts w:ascii="Times New Roman" w:cs="Times New Roman" w:eastAsia="Times New Roman" w:hAnsi="Times New Roman"/>
+                <w:b w:val="false"/>
+                <w:bCs w:val="false"/>
+                <w:color w:val="000000"/>
+                <w:sz w:val="20"/>
+                <w:szCs w:val="20"/>
+              </w:rPr>
+              <w:t xml:space="preserve">Aprobada</w:t>
+            </w:r>
+          </w:p>
+        </w:tc>
+      </w:tr>
+      <w:tr>
+        <w:tc>
+          <w:tcPr>
+            <w:tcMar>
+              <w:top w:type="dxa" w:w="80"/>
+              <w:left w:type="dxa" w:w="120"/>
+              <w:bottom w:type="dxa" w:w="80"/>
+              <w:right w:type="dxa" w:w="120"/>
+            </w:tcMar>
+            <w:vAlign w:val="center"/>
+          </w:tcPr>
+          <w:p>
+            <w:pPr>
+              <w:jc w:val="left"/>
+            </w:pPr>
+            <w:r>
+              <w:rPr>
+                <w:rFonts w:ascii="Times New Roman" w:cs="Times New Roman" w:eastAsia="Times New Roman" w:hAnsi="Times New Roman"/>
+                <w:b w:val="false"/>
+                <w:bCs w:val="false"/>
+                <w:color w:val="000000"/>
+                <w:sz w:val="20"/>
+                <w:szCs w:val="20"/>
+              </w:rPr>
+              <w:t xml:space="preserve">2</w:t>
+            </w:r>
+          </w:p>
+        </w:tc>
+        <w:tc>
+          <w:tcPr>
+            <w:tcMar>
+              <w:top w:type="dxa" w:w="80"/>
+              <w:left w:type="dxa" w:w="120"/>
+              <w:bottom w:type="dxa" w:w="80"/>
+              <w:right w:type="dxa" w:w="120"/>
+            </w:tcMar>
+            <w:vAlign w:val="center"/>
+          </w:tcPr>
+          <w:p>
+            <w:pPr>
+              <w:jc w:val="left"/>
+            </w:pPr>
+            <w:r>
+              <w:rPr>
+                <w:rFonts w:ascii="Times New Roman" w:cs="Times New Roman" w:eastAsia="Times New Roman" w:hAnsi="Times New Roman"/>
+                <w:b w:val="false"/>
+                <w:bCs w:val="false"/>
+                <w:color w:val="000000"/>
+                <w:sz w:val="20"/>
+                <w:szCs w:val="20"/>
+              </w:rPr>
+              <w:t xml:space="preserve">La colección attendance queda marcada en la cola de pendientes</w:t>
+            </w:r>
+          </w:p>
+        </w:tc>
+        <w:tc>
+          <w:tcPr>
+            <w:tcMar>
+              <w:top w:type="dxa" w:w="80"/>
+              <w:left w:type="dxa" w:w="120"/>
+              <w:bottom w:type="dxa" w:w="80"/>
+              <w:right w:type="dxa" w:w="120"/>
+            </w:tcMar>
+            <w:vAlign w:val="center"/>
+          </w:tcPr>
+          <w:p>
+            <w:pPr>
+              <w:jc w:val="left"/>
+            </w:pPr>
+            <w:r>
+              <w:rPr>
+                <w:rFonts w:ascii="Times New Roman" w:cs="Times New Roman" w:eastAsia="Times New Roman" w:hAnsi="Times New Roman"/>
+                <w:b w:val="false"/>
+                <w:bCs w:val="false"/>
+                <w:color w:val="000000"/>
+                <w:sz w:val="20"/>
+                <w:szCs w:val="20"/>
+              </w:rPr>
+              <w:t xml:space="preserve">Aprobada</w:t>
+            </w:r>
+          </w:p>
+        </w:tc>
+      </w:tr>
+      <w:tr>
+        <w:tc>
+          <w:tcPr>
+            <w:shd w:fill="F2F2F2" w:val="clear"/>
+            <w:tcMar>
+              <w:top w:type="dxa" w:w="80"/>
+              <w:left w:type="dxa" w:w="120"/>
+              <w:bottom w:type="dxa" w:w="80"/>
+              <w:right w:type="dxa" w:w="120"/>
+            </w:tcMar>
+            <w:vAlign w:val="center"/>
+          </w:tcPr>
+          <w:p>
+            <w:pPr>
+              <w:jc w:val="left"/>
+            </w:pPr>
+            <w:r>
+              <w:rPr>
+                <w:rFonts w:ascii="Times New Roman" w:cs="Times New Roman" w:eastAsia="Times New Roman" w:hAnsi="Times New Roman"/>
+                <w:b w:val="false"/>
+                <w:bCs w:val="false"/>
+                <w:color w:val="000000"/>
+                <w:sz w:val="20"/>
+                <w:szCs w:val="20"/>
+              </w:rPr>
+              <w:t xml:space="preserve">2</w:t>
+            </w:r>
+          </w:p>
+        </w:tc>
+        <w:tc>
+          <w:tcPr>
+            <w:shd w:fill="F2F2F2" w:val="clear"/>
+            <w:tcMar>
+              <w:top w:type="dxa" w:w="80"/>
+              <w:left w:type="dxa" w:w="120"/>
+              <w:bottom w:type="dxa" w:w="80"/>
+              <w:right w:type="dxa" w:w="120"/>
+            </w:tcMar>
+            <w:vAlign w:val="center"/>
+          </w:tcPr>
+          <w:p>
+            <w:pPr>
+              <w:jc w:val="left"/>
+            </w:pPr>
+            <w:r>
+              <w:rPr>
+                <w:rFonts w:ascii="Times New Roman" w:cs="Times New Roman" w:eastAsia="Times New Roman" w:hAnsi="Times New Roman"/>
+                <w:b w:val="false"/>
+                <w:bCs w:val="false"/>
+                <w:color w:val="000000"/>
+                <w:sz w:val="20"/>
+                <w:szCs w:val="20"/>
+              </w:rPr>
+              <w:t xml:space="preserve">Se avisa que el guardado a Supabase falló y quedó solo local</w:t>
+            </w:r>
+          </w:p>
+        </w:tc>
+        <w:tc>
+          <w:tcPr>
+            <w:shd w:fill="F2F2F2" w:val="clear"/>
+            <w:tcMar>
+              <w:top w:type="dxa" w:w="80"/>
+              <w:left w:type="dxa" w:w="120"/>
+              <w:bottom w:type="dxa" w:w="80"/>
+              <w:right w:type="dxa" w:w="120"/>
+            </w:tcMar>
+            <w:vAlign w:val="center"/>
+          </w:tcPr>
+          <w:p>
+            <w:pPr>
+              <w:jc w:val="left"/>
+            </w:pPr>
+            <w:r>
+              <w:rPr>
+                <w:rFonts w:ascii="Times New Roman" w:cs="Times New Roman" w:eastAsia="Times New Roman" w:hAnsi="Times New Roman"/>
+                <w:b w:val="false"/>
+                <w:bCs w:val="false"/>
+                <w:color w:val="000000"/>
+                <w:sz w:val="20"/>
+                <w:szCs w:val="20"/>
+              </w:rPr>
+              <w:t xml:space="preserve">Aprobada</w:t>
+            </w:r>
+          </w:p>
+        </w:tc>
+      </w:tr>
+      <w:tr>
+        <w:tc>
+          <w:tcPr>
+            <w:tcMar>
+              <w:top w:type="dxa" w:w="80"/>
+              <w:left w:type="dxa" w:w="120"/>
+              <w:bottom w:type="dxa" w:w="80"/>
+              <w:right w:type="dxa" w:w="120"/>
+            </w:tcMar>
+            <w:vAlign w:val="center"/>
+          </w:tcPr>
+          <w:p>
+            <w:pPr>
+              <w:jc w:val="left"/>
+            </w:pPr>
+            <w:r>
+              <w:rPr>
+                <w:rFonts w:ascii="Times New Roman" w:cs="Times New Roman" w:eastAsia="Times New Roman" w:hAnsi="Times New Roman"/>
+                <w:b w:val="false"/>
+                <w:bCs w:val="false"/>
+                <w:color w:val="000000"/>
+                <w:sz w:val="20"/>
+                <w:szCs w:val="20"/>
+              </w:rPr>
+              <w:t xml:space="preserve">2</w:t>
+            </w:r>
+          </w:p>
+        </w:tc>
+        <w:tc>
+          <w:tcPr>
+            <w:tcMar>
+              <w:top w:type="dxa" w:w="80"/>
+              <w:left w:type="dxa" w:w="120"/>
+              <w:bottom w:type="dxa" w:w="80"/>
+              <w:right w:type="dxa" w:w="120"/>
+            </w:tcMar>
+            <w:vAlign w:val="center"/>
+          </w:tcPr>
+          <w:p>
+            <w:pPr>
+              <w:jc w:val="left"/>
+            </w:pPr>
+            <w:r>
+              <w:rPr>
+                <w:rFonts w:ascii="Times New Roman" w:cs="Times New Roman" w:eastAsia="Times New Roman" w:hAnsi="Times New Roman"/>
+                <w:b w:val="false"/>
+                <w:bCs w:val="false"/>
+                <w:color w:val="000000"/>
+                <w:sz w:val="20"/>
+                <w:szCs w:val="20"/>
+              </w:rPr>
+              <w:t xml:space="preserve">No se sube nada a Supabase mientras dura la desconexión</w:t>
+            </w:r>
+          </w:p>
+        </w:tc>
+        <w:tc>
+          <w:tcPr>
+            <w:tcMar>
+              <w:top w:type="dxa" w:w="80"/>
+              <w:left w:type="dxa" w:w="120"/>
+              <w:bottom w:type="dxa" w:w="80"/>
+              <w:right w:type="dxa" w:w="120"/>
+            </w:tcMar>
+            <w:vAlign w:val="center"/>
+          </w:tcPr>
+          <w:p>
+            <w:pPr>
+              <w:jc w:val="left"/>
+            </w:pPr>
+            <w:r>
+              <w:rPr>
+                <w:rFonts w:ascii="Times New Roman" w:cs="Times New Roman" w:eastAsia="Times New Roman" w:hAnsi="Times New Roman"/>
+                <w:b w:val="false"/>
+                <w:bCs w:val="false"/>
+                <w:color w:val="000000"/>
+                <w:sz w:val="20"/>
+                <w:szCs w:val="20"/>
+              </w:rPr>
+              <w:t xml:space="preserve">Aprobada</w:t>
+            </w:r>
+          </w:p>
+        </w:tc>
+      </w:tr>
+      <w:tr>
+        <w:tc>
+          <w:tcPr>
+            <w:shd w:fill="F2F2F2" w:val="clear"/>
+            <w:tcMar>
+              <w:top w:type="dxa" w:w="80"/>
+              <w:left w:type="dxa" w:w="120"/>
+              <w:bottom w:type="dxa" w:w="80"/>
+              <w:right w:type="dxa" w:w="120"/>
+            </w:tcMar>
+            <w:vAlign w:val="center"/>
+          </w:tcPr>
+          <w:p>
+            <w:pPr>
+              <w:jc w:val="left"/>
+            </w:pPr>
+            <w:r>
+              <w:rPr>
+                <w:rFonts w:ascii="Times New Roman" w:cs="Times New Roman" w:eastAsia="Times New Roman" w:hAnsi="Times New Roman"/>
+                <w:b w:val="false"/>
+                <w:bCs w:val="false"/>
+                <w:color w:val="000000"/>
+                <w:sz w:val="20"/>
+                <w:szCs w:val="20"/>
+              </w:rPr>
+              <w:t xml:space="preserve">3</w:t>
+            </w:r>
+          </w:p>
+        </w:tc>
+        <w:tc>
+          <w:tcPr>
+            <w:shd w:fill="F2F2F2" w:val="clear"/>
+            <w:tcMar>
+              <w:top w:type="dxa" w:w="80"/>
+              <w:left w:type="dxa" w:w="120"/>
+              <w:bottom w:type="dxa" w:w="80"/>
+              <w:right w:type="dxa" w:w="120"/>
+            </w:tcMar>
+            <w:vAlign w:val="center"/>
+          </w:tcPr>
+          <w:p>
+            <w:pPr>
+              <w:jc w:val="left"/>
+            </w:pPr>
+            <w:r>
+              <w:rPr>
+                <w:rFonts w:ascii="Times New Roman" w:cs="Times New Roman" w:eastAsia="Times New Roman" w:hAnsi="Times New Roman"/>
+                <w:b w:val="false"/>
+                <w:bCs w:val="false"/>
+                <w:color w:val="000000"/>
+                <w:sz w:val="20"/>
+                <w:szCs w:val="20"/>
+              </w:rPr>
+              <w:t xml:space="preserve">Una segunda colección (alerts) también queda encolada</w:t>
+            </w:r>
+          </w:p>
+        </w:tc>
+        <w:tc>
+          <w:tcPr>
+            <w:shd w:fill="F2F2F2" w:val="clear"/>
+            <w:tcMar>
+              <w:top w:type="dxa" w:w="80"/>
+              <w:left w:type="dxa" w:w="120"/>
+              <w:bottom w:type="dxa" w:w="80"/>
+              <w:right w:type="dxa" w:w="120"/>
+            </w:tcMar>
+            <w:vAlign w:val="center"/>
+          </w:tcPr>
+          <w:p>
+            <w:pPr>
+              <w:jc w:val="left"/>
+            </w:pPr>
+            <w:r>
+              <w:rPr>
+                <w:rFonts w:ascii="Times New Roman" w:cs="Times New Roman" w:eastAsia="Times New Roman" w:hAnsi="Times New Roman"/>
+                <w:b w:val="false"/>
+                <w:bCs w:val="false"/>
+                <w:color w:val="000000"/>
+                <w:sz w:val="20"/>
+                <w:szCs w:val="20"/>
+              </w:rPr>
+              <w:t xml:space="preserve">Aprobada</w:t>
+            </w:r>
+          </w:p>
+        </w:tc>
+      </w:tr>
+      <w:tr>
+        <w:tc>
+          <w:tcPr>
+            <w:tcMar>
+              <w:top w:type="dxa" w:w="80"/>
+              <w:left w:type="dxa" w:w="120"/>
+              <w:bottom w:type="dxa" w:w="80"/>
+              <w:right w:type="dxa" w:w="120"/>
+            </w:tcMar>
+            <w:vAlign w:val="center"/>
+          </w:tcPr>
+          <w:p>
+            <w:pPr>
+              <w:jc w:val="left"/>
+            </w:pPr>
+            <w:r>
+              <w:rPr>
+                <w:rFonts w:ascii="Times New Roman" w:cs="Times New Roman" w:eastAsia="Times New Roman" w:hAnsi="Times New Roman"/>
+                <w:b w:val="false"/>
+                <w:bCs w:val="false"/>
+                <w:color w:val="000000"/>
+                <w:sz w:val="20"/>
+                <w:szCs w:val="20"/>
+              </w:rPr>
+              <w:t xml:space="preserve">4</w:t>
+            </w:r>
+          </w:p>
+        </w:tc>
+        <w:tc>
+          <w:tcPr>
+            <w:tcMar>
+              <w:top w:type="dxa" w:w="80"/>
+              <w:left w:type="dxa" w:w="120"/>
+              <w:bottom w:type="dxa" w:w="80"/>
+              <w:right w:type="dxa" w:w="120"/>
+            </w:tcMar>
+            <w:vAlign w:val="center"/>
+          </w:tcPr>
+          <w:p>
+            <w:pPr>
+              <w:jc w:val="left"/>
+            </w:pPr>
+            <w:r>
+              <w:rPr>
+                <w:rFonts w:ascii="Times New Roman" w:cs="Times New Roman" w:eastAsia="Times New Roman" w:hAnsi="Times New Roman"/>
+                <w:b w:val="false"/>
+                <w:bCs w:val="false"/>
+                <w:color w:val="000000"/>
+                <w:sz w:val="20"/>
+                <w:szCs w:val="20"/>
+              </w:rPr>
+              <w:t xml:space="preserve">El evento online dispara la sincronización sin intervención manual</w:t>
+            </w:r>
+          </w:p>
+        </w:tc>
+        <w:tc>
+          <w:tcPr>
+            <w:tcMar>
+              <w:top w:type="dxa" w:w="80"/>
+              <w:left w:type="dxa" w:w="120"/>
+              <w:bottom w:type="dxa" w:w="80"/>
+              <w:right w:type="dxa" w:w="120"/>
+            </w:tcMar>
+            <w:vAlign w:val="center"/>
+          </w:tcPr>
+          <w:p>
+            <w:pPr>
+              <w:jc w:val="left"/>
+            </w:pPr>
+            <w:r>
+              <w:rPr>
+                <w:rFonts w:ascii="Times New Roman" w:cs="Times New Roman" w:eastAsia="Times New Roman" w:hAnsi="Times New Roman"/>
+                <w:b w:val="false"/>
+                <w:bCs w:val="false"/>
+                <w:color w:val="000000"/>
+                <w:sz w:val="20"/>
+                <w:szCs w:val="20"/>
+              </w:rPr>
+              <w:t xml:space="preserve">Aprobada</w:t>
+            </w:r>
+          </w:p>
+        </w:tc>
+      </w:tr>
+      <w:tr>
+        <w:tc>
+          <w:tcPr>
+            <w:shd w:fill="F2F2F2" w:val="clear"/>
+            <w:tcMar>
+              <w:top w:type="dxa" w:w="80"/>
+              <w:left w:type="dxa" w:w="120"/>
+              <w:bottom w:type="dxa" w:w="80"/>
+              <w:right w:type="dxa" w:w="120"/>
+            </w:tcMar>
+            <w:vAlign w:val="center"/>
+          </w:tcPr>
+          <w:p>
+            <w:pPr>
+              <w:jc w:val="left"/>
+            </w:pPr>
+            <w:r>
+              <w:rPr>
+                <w:rFonts w:ascii="Times New Roman" w:cs="Times New Roman" w:eastAsia="Times New Roman" w:hAnsi="Times New Roman"/>
+                <w:b w:val="false"/>
+                <w:bCs w:val="false"/>
+                <w:color w:val="000000"/>
+                <w:sz w:val="20"/>
+                <w:szCs w:val="20"/>
+              </w:rPr>
+              <w:t xml:space="preserve">4</w:t>
+            </w:r>
+          </w:p>
+        </w:tc>
+        <w:tc>
+          <w:tcPr>
+            <w:shd w:fill="F2F2F2" w:val="clear"/>
+            <w:tcMar>
+              <w:top w:type="dxa" w:w="80"/>
+              <w:left w:type="dxa" w:w="120"/>
+              <w:bottom w:type="dxa" w:w="80"/>
+              <w:right w:type="dxa" w:w="120"/>
+            </w:tcMar>
+            <w:vAlign w:val="center"/>
+          </w:tcPr>
+          <w:p>
+            <w:pPr>
+              <w:jc w:val="left"/>
+            </w:pPr>
+            <w:r>
+              <w:rPr>
+                <w:rFonts w:ascii="Times New Roman" w:cs="Times New Roman" w:eastAsia="Times New Roman" w:hAnsi="Times New Roman"/>
+                <w:b w:val="false"/>
+                <w:bCs w:val="false"/>
+                <w:color w:val="000000"/>
+                <w:sz w:val="20"/>
+                <w:szCs w:val="20"/>
+              </w:rPr>
+              <w:t xml:space="preserve">Se suben a Supabase ambas colecciones pendientes</w:t>
+            </w:r>
+          </w:p>
+        </w:tc>
+        <w:tc>
+          <w:tcPr>
+            <w:shd w:fill="F2F2F2" w:val="clear"/>
+            <w:tcMar>
+              <w:top w:type="dxa" w:w="80"/>
+              <w:left w:type="dxa" w:w="120"/>
+              <w:bottom w:type="dxa" w:w="80"/>
+              <w:right w:type="dxa" w:w="120"/>
+            </w:tcMar>
+            <w:vAlign w:val="center"/>
+          </w:tcPr>
+          <w:p>
+            <w:pPr>
+              <w:jc w:val="left"/>
+            </w:pPr>
+            <w:r>
+              <w:rPr>
+                <w:rFonts w:ascii="Times New Roman" w:cs="Times New Roman" w:eastAsia="Times New Roman" w:hAnsi="Times New Roman"/>
+                <w:b w:val="false"/>
+                <w:bCs w:val="false"/>
+                <w:color w:val="000000"/>
+                <w:sz w:val="20"/>
+                <w:szCs w:val="20"/>
+              </w:rPr>
+              <w:t xml:space="preserve">Aprobada</w:t>
+            </w:r>
+          </w:p>
+        </w:tc>
+      </w:tr>
+      <w:tr>
+        <w:tc>
+          <w:tcPr>
+            <w:tcMar>
+              <w:top w:type="dxa" w:w="80"/>
+              <w:left w:type="dxa" w:w="120"/>
+              <w:bottom w:type="dxa" w:w="80"/>
+              <w:right w:type="dxa" w:w="120"/>
+            </w:tcMar>
+            <w:vAlign w:val="center"/>
+          </w:tcPr>
+          <w:p>
+            <w:pPr>
+              <w:jc w:val="left"/>
+            </w:pPr>
+            <w:r>
+              <w:rPr>
+                <w:rFonts w:ascii="Times New Roman" w:cs="Times New Roman" w:eastAsia="Times New Roman" w:hAnsi="Times New Roman"/>
+                <w:b w:val="false"/>
+                <w:bCs w:val="false"/>
+                <w:color w:val="000000"/>
+                <w:sz w:val="20"/>
+                <w:szCs w:val="20"/>
+              </w:rPr>
+              <w:t xml:space="preserve">4</w:t>
+            </w:r>
+          </w:p>
+        </w:tc>
+        <w:tc>
+          <w:tcPr>
+            <w:tcMar>
+              <w:top w:type="dxa" w:w="80"/>
+              <w:left w:type="dxa" w:w="120"/>
+              <w:bottom w:type="dxa" w:w="80"/>
+              <w:right w:type="dxa" w:w="120"/>
+            </w:tcMar>
+            <w:vAlign w:val="center"/>
+          </w:tcPr>
+          <w:p>
+            <w:pPr>
+              <w:jc w:val="left"/>
+            </w:pPr>
+            <w:r>
+              <w:rPr>
+                <w:rFonts w:ascii="Times New Roman" w:cs="Times New Roman" w:eastAsia="Times New Roman" w:hAnsi="Times New Roman"/>
+                <w:b w:val="false"/>
+                <w:bCs w:val="false"/>
+                <w:color w:val="000000"/>
+                <w:sz w:val="20"/>
+                <w:szCs w:val="20"/>
+              </w:rPr>
+              <w:t xml:space="preserve">El valor subido es el más reciente, no uno desactualizado</w:t>
+            </w:r>
+          </w:p>
+        </w:tc>
+        <w:tc>
+          <w:tcPr>
+            <w:tcMar>
+              <w:top w:type="dxa" w:w="80"/>
+              <w:left w:type="dxa" w:w="120"/>
+              <w:bottom w:type="dxa" w:w="80"/>
+              <w:right w:type="dxa" w:w="120"/>
+            </w:tcMar>
+            <w:vAlign w:val="center"/>
+          </w:tcPr>
+          <w:p>
+            <w:pPr>
+              <w:jc w:val="left"/>
+            </w:pPr>
+            <w:r>
+              <w:rPr>
+                <w:rFonts w:ascii="Times New Roman" w:cs="Times New Roman" w:eastAsia="Times New Roman" w:hAnsi="Times New Roman"/>
+                <w:b w:val="false"/>
+                <w:bCs w:val="false"/>
+                <w:color w:val="000000"/>
+                <w:sz w:val="20"/>
+                <w:szCs w:val="20"/>
+              </w:rPr>
+              <w:t xml:space="preserve">Aprobada</w:t>
+            </w:r>
+          </w:p>
+        </w:tc>
+      </w:tr>
+      <w:tr>
+        <w:tc>
+          <w:tcPr>
+            <w:shd w:fill="F2F2F2" w:val="clear"/>
+            <w:tcMar>
+              <w:top w:type="dxa" w:w="80"/>
+              <w:left w:type="dxa" w:w="120"/>
+              <w:bottom w:type="dxa" w:w="80"/>
+              <w:right w:type="dxa" w:w="120"/>
+            </w:tcMar>
+            <w:vAlign w:val="center"/>
+          </w:tcPr>
+          <w:p>
+            <w:pPr>
+              <w:jc w:val="left"/>
+            </w:pPr>
+            <w:r>
+              <w:rPr>
+                <w:rFonts w:ascii="Times New Roman" w:cs="Times New Roman" w:eastAsia="Times New Roman" w:hAnsi="Times New Roman"/>
+                <w:b w:val="false"/>
+                <w:bCs w:val="false"/>
+                <w:color w:val="000000"/>
+                <w:sz w:val="20"/>
+                <w:szCs w:val="20"/>
+              </w:rPr>
+              <w:t xml:space="preserve">4</w:t>
+            </w:r>
+          </w:p>
+        </w:tc>
+        <w:tc>
+          <w:tcPr>
+            <w:shd w:fill="F2F2F2" w:val="clear"/>
+            <w:tcMar>
+              <w:top w:type="dxa" w:w="80"/>
+              <w:left w:type="dxa" w:w="120"/>
+              <w:bottom w:type="dxa" w:w="80"/>
+              <w:right w:type="dxa" w:w="120"/>
+            </w:tcMar>
+            <w:vAlign w:val="center"/>
+          </w:tcPr>
+          <w:p>
+            <w:pPr>
+              <w:jc w:val="left"/>
+            </w:pPr>
+            <w:r>
+              <w:rPr>
+                <w:rFonts w:ascii="Times New Roman" w:cs="Times New Roman" w:eastAsia="Times New Roman" w:hAnsi="Times New Roman"/>
+                <w:b w:val="false"/>
+                <w:bCs w:val="false"/>
+                <w:color w:val="000000"/>
+                <w:sz w:val="20"/>
+                <w:szCs w:val="20"/>
+              </w:rPr>
+              <w:t xml:space="preserve">Se muestra el aviso de confirmación de sincronización</w:t>
+            </w:r>
+          </w:p>
+        </w:tc>
+        <w:tc>
+          <w:tcPr>
+            <w:shd w:fill="F2F2F2" w:val="clear"/>
+            <w:tcMar>
+              <w:top w:type="dxa" w:w="80"/>
+              <w:left w:type="dxa" w:w="120"/>
+              <w:bottom w:type="dxa" w:w="80"/>
+              <w:right w:type="dxa" w:w="120"/>
+            </w:tcMar>
+            <w:vAlign w:val="center"/>
+          </w:tcPr>
+          <w:p>
+            <w:pPr>
+              <w:jc w:val="left"/>
+            </w:pPr>
+            <w:r>
+              <w:rPr>
+                <w:rFonts w:ascii="Times New Roman" w:cs="Times New Roman" w:eastAsia="Times New Roman" w:hAnsi="Times New Roman"/>
+                <w:b w:val="false"/>
+                <w:bCs w:val="false"/>
+                <w:color w:val="000000"/>
+                <w:sz w:val="20"/>
+                <w:szCs w:val="20"/>
+              </w:rPr>
+              <w:t xml:space="preserve">Aprobada</w:t>
+            </w:r>
+          </w:p>
+        </w:tc>
+      </w:tr>
+      <w:tr>
+        <w:tc>
+          <w:tcPr>
+            <w:tcMar>
+              <w:top w:type="dxa" w:w="80"/>
+              <w:left w:type="dxa" w:w="120"/>
+              <w:bottom w:type="dxa" w:w="80"/>
+              <w:right w:type="dxa" w:w="120"/>
+            </w:tcMar>
+            <w:vAlign w:val="center"/>
+          </w:tcPr>
+          <w:p>
+            <w:pPr>
+              <w:jc w:val="left"/>
+            </w:pPr>
+            <w:r>
+              <w:rPr>
+                <w:rFonts w:ascii="Times New Roman" w:cs="Times New Roman" w:eastAsia="Times New Roman" w:hAnsi="Times New Roman"/>
+                <w:b w:val="false"/>
+                <w:bCs w:val="false"/>
+                <w:color w:val="000000"/>
+                <w:sz w:val="20"/>
+                <w:szCs w:val="20"/>
+              </w:rPr>
+              <w:t xml:space="preserve">5</w:t>
+            </w:r>
+          </w:p>
+        </w:tc>
+        <w:tc>
+          <w:tcPr>
+            <w:tcMar>
+              <w:top w:type="dxa" w:w="80"/>
+              <w:left w:type="dxa" w:w="120"/>
+              <w:bottom w:type="dxa" w:w="80"/>
+              <w:right w:type="dxa" w:w="120"/>
+            </w:tcMar>
+            <w:vAlign w:val="center"/>
+          </w:tcPr>
+          <w:p>
+            <w:pPr>
+              <w:jc w:val="left"/>
+            </w:pPr>
+            <w:r>
+              <w:rPr>
+                <w:rFonts w:ascii="Times New Roman" w:cs="Times New Roman" w:eastAsia="Times New Roman" w:hAnsi="Times New Roman"/>
+                <w:b w:val="false"/>
+                <w:bCs w:val="false"/>
+                <w:color w:val="000000"/>
+                <w:sz w:val="20"/>
+                <w:szCs w:val="20"/>
+              </w:rPr>
+              <w:t xml:space="preserve">Una licencia guardada offline queda pendiente antes de "recargar"</w:t>
+            </w:r>
+          </w:p>
+        </w:tc>
+        <w:tc>
+          <w:tcPr>
+            <w:tcMar>
+              <w:top w:type="dxa" w:w="80"/>
+              <w:left w:type="dxa" w:w="120"/>
+              <w:bottom w:type="dxa" w:w="80"/>
+              <w:right w:type="dxa" w:w="120"/>
+            </w:tcMar>
+            <w:vAlign w:val="center"/>
+          </w:tcPr>
+          <w:p>
+            <w:pPr>
+              <w:jc w:val="left"/>
+            </w:pPr>
+            <w:r>
+              <w:rPr>
+                <w:rFonts w:ascii="Times New Roman" w:cs="Times New Roman" w:eastAsia="Times New Roman" w:hAnsi="Times New Roman"/>
+                <w:b w:val="false"/>
+                <w:bCs w:val="false"/>
+                <w:color w:val="000000"/>
+                <w:sz w:val="20"/>
+                <w:szCs w:val="20"/>
+              </w:rPr>
+              <w:t xml:space="preserve">Aprobada</w:t>
+            </w:r>
+          </w:p>
+        </w:tc>
+      </w:tr>
+      <w:tr>
+        <w:tc>
+          <w:tcPr>
+            <w:shd w:fill="F2F2F2" w:val="clear"/>
+            <w:tcMar>
+              <w:top w:type="dxa" w:w="80"/>
+              <w:left w:type="dxa" w:w="120"/>
+              <w:bottom w:type="dxa" w:w="80"/>
+              <w:right w:type="dxa" w:w="120"/>
+            </w:tcMar>
+            <w:vAlign w:val="center"/>
+          </w:tcPr>
+          <w:p>
+            <w:pPr>
+              <w:jc w:val="left"/>
+            </w:pPr>
+            <w:r>
+              <w:rPr>
+                <w:rFonts w:ascii="Times New Roman" w:cs="Times New Roman" w:eastAsia="Times New Roman" w:hAnsi="Times New Roman"/>
+                <w:b w:val="false"/>
+                <w:bCs w:val="false"/>
+                <w:color w:val="000000"/>
+                <w:sz w:val="20"/>
+                <w:szCs w:val="20"/>
+              </w:rPr>
+              <w:t xml:space="preserve">5</w:t>
+            </w:r>
+          </w:p>
+        </w:tc>
+        <w:tc>
+          <w:tcPr>
+            <w:shd w:fill="F2F2F2" w:val="clear"/>
+            <w:tcMar>
+              <w:top w:type="dxa" w:w="80"/>
+              <w:left w:type="dxa" w:w="120"/>
+              <w:bottom w:type="dxa" w:w="80"/>
+              <w:right w:type="dxa" w:w="120"/>
+            </w:tcMar>
+            <w:vAlign w:val="center"/>
+          </w:tcPr>
+          <w:p>
+            <w:pPr>
+              <w:jc w:val="left"/>
+            </w:pPr>
+            <w:r>
+              <w:rPr>
+                <w:rFonts w:ascii="Times New Roman" w:cs="Times New Roman" w:eastAsia="Times New Roman" w:hAnsi="Times New Roman"/>
+                <w:b w:val="false"/>
+                <w:bCs w:val="false"/>
+                <w:color w:val="000000"/>
+                <w:sz w:val="20"/>
+                <w:szCs w:val="20"/>
+              </w:rPr>
+              <w:t xml:space="preserve">El pendiente sobrevive a la recarga simulada de la página</w:t>
+            </w:r>
+          </w:p>
+        </w:tc>
+        <w:tc>
+          <w:tcPr>
+            <w:shd w:fill="F2F2F2" w:val="clear"/>
+            <w:tcMar>
+              <w:top w:type="dxa" w:w="80"/>
+              <w:left w:type="dxa" w:w="120"/>
+              <w:bottom w:type="dxa" w:w="80"/>
+              <w:right w:type="dxa" w:w="120"/>
+            </w:tcMar>
+            <w:vAlign w:val="center"/>
+          </w:tcPr>
+          <w:p>
+            <w:pPr>
+              <w:jc w:val="left"/>
+            </w:pPr>
+            <w:r>
+              <w:rPr>
+                <w:rFonts w:ascii="Times New Roman" w:cs="Times New Roman" w:eastAsia="Times New Roman" w:hAnsi="Times New Roman"/>
+                <w:b w:val="false"/>
+                <w:bCs w:val="false"/>
+                <w:color w:val="000000"/>
+                <w:sz w:val="20"/>
+                <w:szCs w:val="20"/>
+              </w:rPr>
+              <w:t xml:space="preserve">Aprobada</w:t>
+            </w:r>
+          </w:p>
+        </w:tc>
+      </w:tr>
+      <w:tr>
+        <w:tc>
+          <w:tcPr>
+            <w:tcMar>
+              <w:top w:type="dxa" w:w="80"/>
+              <w:left w:type="dxa" w:w="120"/>
+              <w:bottom w:type="dxa" w:w="80"/>
+              <w:right w:type="dxa" w:w="120"/>
+            </w:tcMar>
+            <w:vAlign w:val="center"/>
+          </w:tcPr>
+          <w:p>
+            <w:pPr>
+              <w:jc w:val="left"/>
+            </w:pPr>
+            <w:r>
+              <w:rPr>
+                <w:rFonts w:ascii="Times New Roman" w:cs="Times New Roman" w:eastAsia="Times New Roman" w:hAnsi="Times New Roman"/>
+                <w:b w:val="false"/>
+                <w:bCs w:val="false"/>
+                <w:color w:val="000000"/>
+                <w:sz w:val="20"/>
+                <w:szCs w:val="20"/>
+              </w:rPr>
+              <w:t xml:space="preserve">6</w:t>
+            </w:r>
+          </w:p>
+        </w:tc>
+        <w:tc>
+          <w:tcPr>
+            <w:tcMar>
+              <w:top w:type="dxa" w:w="80"/>
+              <w:left w:type="dxa" w:w="120"/>
+              <w:bottom w:type="dxa" w:w="80"/>
+              <w:right w:type="dxa" w:w="120"/>
+            </w:tcMar>
+            <w:vAlign w:val="center"/>
+          </w:tcPr>
+          <w:p>
+            <w:pPr>
+              <w:jc w:val="left"/>
+            </w:pPr>
+            <w:r>
+              <w:rPr>
+                <w:rFonts w:ascii="Times New Roman" w:cs="Times New Roman" w:eastAsia="Times New Roman" w:hAnsi="Times New Roman"/>
+                <w:b w:val="false"/>
+                <w:bCs w:val="false"/>
+                <w:color w:val="000000"/>
+                <w:sz w:val="20"/>
+                <w:szCs w:val="20"/>
+              </w:rPr>
+              <w:t xml:space="preserve">Al reabrir con señal, se sincroniza solo lo pendiente de la sesión anterior</w:t>
+            </w:r>
+          </w:p>
+        </w:tc>
+        <w:tc>
+          <w:tcPr>
+            <w:tcMar>
+              <w:top w:type="dxa" w:w="80"/>
+              <w:left w:type="dxa" w:w="120"/>
+              <w:bottom w:type="dxa" w:w="80"/>
+              <w:right w:type="dxa" w:w="120"/>
+            </w:tcMar>
+            <w:vAlign w:val="center"/>
+          </w:tcPr>
+          <w:p>
+            <w:pPr>
+              <w:jc w:val="left"/>
+            </w:pPr>
+            <w:r>
+              <w:rPr>
+                <w:rFonts w:ascii="Times New Roman" w:cs="Times New Roman" w:eastAsia="Times New Roman" w:hAnsi="Times New Roman"/>
+                <w:b w:val="false"/>
+                <w:bCs w:val="false"/>
+                <w:color w:val="000000"/>
+                <w:sz w:val="20"/>
+                <w:szCs w:val="20"/>
+              </w:rPr>
+              <w:t xml:space="preserve">Aprobada</w:t>
+            </w:r>
+          </w:p>
+        </w:tc>
+      </w:tr>
+      <w:tr>
+        <w:tc>
+          <w:tcPr>
+            <w:shd w:fill="F2F2F2" w:val="clear"/>
+            <w:tcMar>
+              <w:top w:type="dxa" w:w="80"/>
+              <w:left w:type="dxa" w:w="120"/>
+              <w:bottom w:type="dxa" w:w="80"/>
+              <w:right w:type="dxa" w:w="120"/>
+            </w:tcMar>
+            <w:vAlign w:val="center"/>
+          </w:tcPr>
+          <w:p>
+            <w:pPr>
+              <w:jc w:val="left"/>
+            </w:pPr>
+            <w:r>
+              <w:rPr>
+                <w:rFonts w:ascii="Times New Roman" w:cs="Times New Roman" w:eastAsia="Times New Roman" w:hAnsi="Times New Roman"/>
+                <w:b w:val="false"/>
+                <w:bCs w:val="false"/>
+                <w:color w:val="000000"/>
+                <w:sz w:val="20"/>
+                <w:szCs w:val="20"/>
+              </w:rPr>
+              <w:t xml:space="preserve">6</w:t>
+            </w:r>
+          </w:p>
+        </w:tc>
+        <w:tc>
+          <w:tcPr>
+            <w:shd w:fill="F2F2F2" w:val="clear"/>
+            <w:tcMar>
+              <w:top w:type="dxa" w:w="80"/>
+              <w:left w:type="dxa" w:w="120"/>
+              <w:bottom w:type="dxa" w:w="80"/>
+              <w:right w:type="dxa" w:w="120"/>
+            </w:tcMar>
+            <w:vAlign w:val="center"/>
+          </w:tcPr>
+          <w:p>
+            <w:pPr>
+              <w:jc w:val="left"/>
+            </w:pPr>
+            <w:r>
+              <w:rPr>
+                <w:rFonts w:ascii="Times New Roman" w:cs="Times New Roman" w:eastAsia="Times New Roman" w:hAnsi="Times New Roman"/>
+                <w:b w:val="false"/>
+                <w:bCs w:val="false"/>
+                <w:color w:val="000000"/>
+                <w:sz w:val="20"/>
+                <w:szCs w:val="20"/>
+              </w:rPr>
+              <w:t xml:space="preserve">El dato subido en la reapertura es el correcto</w:t>
+            </w:r>
+          </w:p>
+        </w:tc>
+        <w:tc>
+          <w:tcPr>
+            <w:shd w:fill="F2F2F2" w:val="clear"/>
+            <w:tcMar>
+              <w:top w:type="dxa" w:w="80"/>
+              <w:left w:type="dxa" w:w="120"/>
+              <w:bottom w:type="dxa" w:w="80"/>
+              <w:right w:type="dxa" w:w="120"/>
+            </w:tcMar>
+            <w:vAlign w:val="center"/>
+          </w:tcPr>
+          <w:p>
+            <w:pPr>
+              <w:jc w:val="left"/>
+            </w:pPr>
+            <w:r>
+              <w:rPr>
+                <w:rFonts w:ascii="Times New Roman" w:cs="Times New Roman" w:eastAsia="Times New Roman" w:hAnsi="Times New Roman"/>
+                <w:b w:val="false"/>
+                <w:bCs w:val="false"/>
+                <w:color w:val="000000"/>
+                <w:sz w:val="20"/>
+                <w:szCs w:val="20"/>
+              </w:rPr>
+              <w:t xml:space="preserve">Aprobada</w:t>
+            </w:r>
+          </w:p>
+        </w:tc>
+      </w:tr>
+    </w:tbl>
+    <w:p>
+      <w:pPr>
+        <w:spacing w:after="0" w:line="480" w:lineRule="auto"/>
+        <w:jc w:val="both"/>
+      </w:pPr>
+      <w:r>
+        <w:rPr>
+          <w:rFonts w:ascii="Times New Roman" w:cs="Times New Roman" w:eastAsia="Times New Roman" w:hAnsi="Times New Roman"/>
+          <w:b w:val="false"/>
+          <w:bCs w:val="false"/>
+          <w:i w:val="false"/>
+          <w:iCs w:val="false"/>
+          <w:sz w:val="24"/>
+          <w:szCs w:val="24"/>
+        </w:rPr>
+        <w:t xml:space="preserve">El código completo del arnés se conserva versionado en el repositorio (tests/test_offline_sync.js) y puede ejecutarse en cualquier momento con npm test, incluyéndose como parte de la validación recomendada antes de modificar la lógica de persistencia de la aplicación.</w:t>
       </w:r>
     </w:p>
     <w:p>

</xml_diff>